<commit_message>
Update Scam Shield AI assessment and README
</commit_message>
<xml_diff>
--- a/ScamShieldAI_Assessment.docx
+++ b/ScamShieldAI_Assessment.docx
@@ -31,6 +31,9 @@
         <w:gridCol w:w="4932"/>
       </w:tblGrid>
       <w:tr>
+        <w:trPr>
+          <w:cantSplit/>
+        </w:trPr>
         <w:tc>
           <w:tcPr>
             <w:tcW w:type="dxa" w:w="4932"/>
@@ -113,6 +116,9 @@
         </w:tc>
       </w:tr>
       <w:tr>
+        <w:trPr>
+          <w:cantSplit/>
+        </w:trPr>
         <w:tc>
           <w:tcPr>
             <w:tcW w:type="dxa" w:w="4932"/>
@@ -195,6 +201,9 @@
         </w:tc>
       </w:tr>
       <w:tr>
+        <w:trPr>
+          <w:cantSplit/>
+        </w:trPr>
         <w:tc>
           <w:tcPr>
             <w:tcW w:type="dxa" w:w="4932"/>
@@ -271,12 +280,15 @@
                 <w:rFonts w:ascii="Times New Roman" w:hAnsi="Times New Roman"/>
                 <w:sz w:val="20"/>
               </w:rPr>
-              <w:t>____________________</w:t>
+              <w:t>Ryan Global</w:t>
             </w:r>
           </w:p>
         </w:tc>
       </w:tr>
       <w:tr>
+        <w:trPr>
+          <w:cantSplit/>
+        </w:trPr>
         <w:tc>
           <w:tcPr>
             <w:tcW w:type="dxa" w:w="4932"/>
@@ -393,7 +405,7 @@
     </w:p>
     <w:p>
       <w:r>
-        <w:t>The live Dialogflow ES agent contains 21 intents and 10 custom entities. Thirteen recorded English scenario checks passed, and the later English greeting screenshot matched Welcome. Hindi is selectable in the agent; the recorded Hindi scam requests reached fallback or an unrelated intent. A separate Hindi package was not active during those observations.</w:t>
+        <w:t>The Dialogflow ES agent is documented as containing 21 intents and 10 custom entities. In the recorded console tests, 13 English scenarios matched the intended intents, and an additional English greeting matched Default Welcome Intent. Hindi can be selected in the console, but the recorded Hindi scam requests did not reliably match the relevant intents. Reliable Hindi support has not been demonstrated in these tests.</w:t>
       </w:r>
     </w:p>
     <w:p>
@@ -406,7 +418,7 @@
     </w:p>
     <w:p>
       <w:r>
-        <w:t>The intended users include digital payment customers, students and job seekers, older adults, and people who may already have sent money or shared a credential. The design focuses on urgency cues, unfamiliar links, advance fees, and requests for OTPs or UPI PINs. These user groups informed the prototype design.</w:t>
+        <w:t>The prototype is intended for digital payment customers, students and job seekers, older adults, and people who may already have sent money or shared a credential. I focused the scenarios on urgent payment requests, unfamiliar links, advance fees, and requests for OTPs or UPI PINs. These groups and scenarios define the intended use of the prototype; they are not presented as findings from interviews or surveys.</w:t>
       </w:r>
     </w:p>
     <w:p>
@@ -448,6 +460,7 @@
       <w:tr>
         <w:trPr>
           <w:tblHeader w:val="true"/>
+          <w:cantSplit/>
         </w:trPr>
         <w:tc>
           <w:tcPr>
@@ -517,6 +530,9 @@
         </w:tc>
       </w:tr>
       <w:tr>
+        <w:trPr>
+          <w:cantSplit/>
+        </w:trPr>
         <w:tc>
           <w:tcPr>
             <w:tcW w:type="dxa" w:w="2880"/>
@@ -581,6 +597,9 @@
         </w:tc>
       </w:tr>
       <w:tr>
+        <w:trPr>
+          <w:cantSplit/>
+        </w:trPr>
         <w:tc>
           <w:tcPr>
             <w:tcW w:type="dxa" w:w="2880"/>
@@ -647,6 +666,9 @@
         </w:tc>
       </w:tr>
       <w:tr>
+        <w:trPr>
+          <w:cantSplit/>
+        </w:trPr>
         <w:tc>
           <w:tcPr>
             <w:tcW w:type="dxa" w:w="2880"/>
@@ -711,6 +733,9 @@
         </w:tc>
       </w:tr>
       <w:tr>
+        <w:trPr>
+          <w:cantSplit/>
+        </w:trPr>
         <w:tc>
           <w:tcPr>
             <w:tcW w:type="dxa" w:w="2880"/>
@@ -777,6 +802,9 @@
         </w:tc>
       </w:tr>
       <w:tr>
+        <w:trPr>
+          <w:cantSplit/>
+        </w:trPr>
         <w:tc>
           <w:tcPr>
             <w:tcW w:type="dxa" w:w="2880"/>
@@ -841,6 +869,9 @@
         </w:tc>
       </w:tr>
       <w:tr>
+        <w:trPr>
+          <w:cantSplit/>
+        </w:trPr>
         <w:tc>
           <w:tcPr>
             <w:tcW w:type="dxa" w:w="2880"/>
@@ -901,12 +932,15 @@
                 <w:b w:val="0"/>
                 <w:sz w:val="18"/>
               </w:rPr>
-              <w:t>bank, employer, courier, support</w:t>
+              <w:t>bank, government, employer, courier, support</w:t>
             </w:r>
           </w:p>
         </w:tc>
       </w:tr>
       <w:tr>
+        <w:trPr>
+          <w:cantSplit/>
+        </w:trPr>
         <w:tc>
           <w:tcPr>
             <w:tcW w:type="dxa" w:w="2880"/>
@@ -971,6 +1005,9 @@
         </w:tc>
       </w:tr>
       <w:tr>
+        <w:trPr>
+          <w:cantSplit/>
+        </w:trPr>
         <w:tc>
           <w:tcPr>
             <w:tcW w:type="dxa" w:w="2880"/>
@@ -1037,6 +1074,9 @@
         </w:tc>
       </w:tr>
       <w:tr>
+        <w:trPr>
+          <w:cantSplit/>
+        </w:trPr>
         <w:tc>
           <w:tcPr>
             <w:tcW w:type="dxa" w:w="2880"/>
@@ -1101,6 +1141,9 @@
         </w:tc>
       </w:tr>
       <w:tr>
+        <w:trPr>
+          <w:cantSplit/>
+        </w:trPr>
         <w:tc>
           <w:tcPr>
             <w:tcW w:type="dxa" w:w="2880"/>
@@ -1194,6 +1237,7 @@
       <w:tr>
         <w:trPr>
           <w:tblHeader w:val="true"/>
+          <w:cantSplit/>
         </w:trPr>
         <w:tc>
           <w:tcPr>
@@ -1296,6 +1340,9 @@
         </w:tc>
       </w:tr>
       <w:tr>
+        <w:trPr>
+          <w:cantSplit/>
+        </w:trPr>
         <w:tc>
           <w:tcPr>
             <w:tcW w:type="dxa" w:w="3240"/>
@@ -1391,6 +1438,9 @@
         </w:tc>
       </w:tr>
       <w:tr>
+        <w:trPr>
+          <w:cantSplit/>
+        </w:trPr>
         <w:tc>
           <w:tcPr>
             <w:tcW w:type="dxa" w:w="3240"/>
@@ -1489,6 +1539,9 @@
         </w:tc>
       </w:tr>
       <w:tr>
+        <w:trPr>
+          <w:cantSplit/>
+        </w:trPr>
         <w:tc>
           <w:tcPr>
             <w:tcW w:type="dxa" w:w="3240"/>
@@ -1584,6 +1637,9 @@
         </w:tc>
       </w:tr>
       <w:tr>
+        <w:trPr>
+          <w:cantSplit/>
+        </w:trPr>
         <w:tc>
           <w:tcPr>
             <w:tcW w:type="dxa" w:w="3240"/>
@@ -1682,6 +1738,9 @@
         </w:tc>
       </w:tr>
       <w:tr>
+        <w:trPr>
+          <w:cantSplit/>
+        </w:trPr>
         <w:tc>
           <w:tcPr>
             <w:tcW w:type="dxa" w:w="3240"/>
@@ -1777,6 +1836,9 @@
         </w:tc>
       </w:tr>
       <w:tr>
+        <w:trPr>
+          <w:cantSplit/>
+        </w:trPr>
         <w:tc>
           <w:tcPr>
             <w:tcW w:type="dxa" w:w="3240"/>
@@ -1875,6 +1937,9 @@
         </w:tc>
       </w:tr>
       <w:tr>
+        <w:trPr>
+          <w:cantSplit/>
+        </w:trPr>
         <w:tc>
           <w:tcPr>
             <w:tcW w:type="dxa" w:w="3240"/>
@@ -1970,6 +2035,9 @@
         </w:tc>
       </w:tr>
       <w:tr>
+        <w:trPr>
+          <w:cantSplit/>
+        </w:trPr>
         <w:tc>
           <w:tcPr>
             <w:tcW w:type="dxa" w:w="3240"/>
@@ -2068,6 +2136,9 @@
         </w:tc>
       </w:tr>
       <w:tr>
+        <w:trPr>
+          <w:cantSplit/>
+        </w:trPr>
         <w:tc>
           <w:tcPr>
             <w:tcW w:type="dxa" w:w="3240"/>
@@ -2163,6 +2234,9 @@
         </w:tc>
       </w:tr>
       <w:tr>
+        <w:trPr>
+          <w:cantSplit/>
+        </w:trPr>
         <w:tc>
           <w:tcPr>
             <w:tcW w:type="dxa" w:w="3240"/>
@@ -2261,6 +2335,9 @@
         </w:tc>
       </w:tr>
       <w:tr>
+        <w:trPr>
+          <w:cantSplit/>
+        </w:trPr>
         <w:tc>
           <w:tcPr>
             <w:tcW w:type="dxa" w:w="3240"/>
@@ -2356,6 +2433,9 @@
         </w:tc>
       </w:tr>
       <w:tr>
+        <w:trPr>
+          <w:cantSplit/>
+        </w:trPr>
         <w:tc>
           <w:tcPr>
             <w:tcW w:type="dxa" w:w="3240"/>
@@ -2454,6 +2534,9 @@
         </w:tc>
       </w:tr>
       <w:tr>
+        <w:trPr>
+          <w:cantSplit/>
+        </w:trPr>
         <w:tc>
           <w:tcPr>
             <w:tcW w:type="dxa" w:w="3240"/>
@@ -2549,6 +2632,9 @@
         </w:tc>
       </w:tr>
       <w:tr>
+        <w:trPr>
+          <w:cantSplit/>
+        </w:trPr>
         <w:tc>
           <w:tcPr>
             <w:tcW w:type="dxa" w:w="3240"/>
@@ -2647,6 +2733,9 @@
         </w:tc>
       </w:tr>
       <w:tr>
+        <w:trPr>
+          <w:cantSplit/>
+        </w:trPr>
         <w:tc>
           <w:tcPr>
             <w:tcW w:type="dxa" w:w="3240"/>
@@ -2742,6 +2831,9 @@
         </w:tc>
       </w:tr>
       <w:tr>
+        <w:trPr>
+          <w:cantSplit/>
+        </w:trPr>
         <w:tc>
           <w:tcPr>
             <w:tcW w:type="dxa" w:w="3240"/>
@@ -2840,6 +2932,9 @@
         </w:tc>
       </w:tr>
       <w:tr>
+        <w:trPr>
+          <w:cantSplit/>
+        </w:trPr>
         <w:tc>
           <w:tcPr>
             <w:tcW w:type="dxa" w:w="3240"/>
@@ -2935,6 +3030,9 @@
         </w:tc>
       </w:tr>
       <w:tr>
+        <w:trPr>
+          <w:cantSplit/>
+        </w:trPr>
         <w:tc>
           <w:tcPr>
             <w:tcW w:type="dxa" w:w="3240"/>
@@ -3033,6 +3131,9 @@
         </w:tc>
       </w:tr>
       <w:tr>
+        <w:trPr>
+          <w:cantSplit/>
+        </w:trPr>
         <w:tc>
           <w:tcPr>
             <w:tcW w:type="dxa" w:w="3240"/>
@@ -3128,6 +3229,9 @@
         </w:tc>
       </w:tr>
       <w:tr>
+        <w:trPr>
+          <w:cantSplit/>
+        </w:trPr>
         <w:tc>
           <w:tcPr>
             <w:tcW w:type="dxa" w:w="3240"/>
@@ -3226,6 +3330,9 @@
         </w:tc>
       </w:tr>
       <w:tr>
+        <w:trPr>
+          <w:cantSplit/>
+        </w:trPr>
         <w:tc>
           <w:tcPr>
             <w:tcW w:type="dxa" w:w="3240"/>
@@ -3336,7 +3443,7 @@
     </w:p>
     <w:p>
       <w:r>
-        <w:t>The table gives one representative training phrase and a concise description of the configured English response for each custom intent. The import package contains the full set of example phrases and exact response text.</w:t>
+        <w:t>The table gives one example training phrase and an excerpt from the configured English response for each custom intent. The prepared import is described as containing the complete training phrases and response texts; the excerpts below are shortened for readability.</w:t>
       </w:r>
     </w:p>
     <w:tbl>
@@ -3353,6 +3460,7 @@
       <w:tr>
         <w:trPr>
           <w:tblHeader w:val="true"/>
+          <w:cantSplit/>
         </w:trPr>
         <w:tc>
           <w:tcPr>
@@ -3381,7 +3489,7 @@
                 <w:rFonts w:ascii="Arial" w:hAnsi="Arial"/>
                 <w:b/>
                 <w:color w:val="FFFFFF"/>
-                <w:sz w:val="17"/>
+                <w:sz w:val="16"/>
               </w:rPr>
               <w:t>Intent</w:t>
             </w:r>
@@ -3455,6 +3563,9 @@
         </w:tc>
       </w:tr>
       <w:tr>
+        <w:trPr>
+          <w:cantSplit/>
+        </w:trPr>
         <w:tc>
           <w:tcPr>
             <w:tcW w:type="dxa" w:w="2304"/>
@@ -3480,7 +3591,7 @@
               <w:rPr>
                 <w:rFonts w:ascii="Arial" w:hAnsi="Arial"/>
                 <w:b w:val="0"/>
-                <w:sz w:val="18"/>
+                <w:sz w:val="16"/>
               </w:rPr>
               <w:t>ScamCheckIntent</w:t>
             </w:r>
@@ -3550,6 +3661,9 @@
         </w:tc>
       </w:tr>
       <w:tr>
+        <w:trPr>
+          <w:cantSplit/>
+        </w:trPr>
         <w:tc>
           <w:tcPr>
             <w:tcW w:type="dxa" w:w="2304"/>
@@ -3576,7 +3690,7 @@
               <w:rPr>
                 <w:rFonts w:ascii="Arial" w:hAnsi="Arial"/>
                 <w:b w:val="0"/>
-                <w:sz w:val="18"/>
+                <w:sz w:val="16"/>
               </w:rPr>
               <w:t>ScamDetailsIntent</w:t>
             </w:r>
@@ -3648,6 +3762,9 @@
         </w:tc>
       </w:tr>
       <w:tr>
+        <w:trPr>
+          <w:cantSplit/>
+        </w:trPr>
         <w:tc>
           <w:tcPr>
             <w:tcW w:type="dxa" w:w="2304"/>
@@ -3673,7 +3790,7 @@
               <w:rPr>
                 <w:rFonts w:ascii="Arial" w:hAnsi="Arial"/>
                 <w:b w:val="0"/>
-                <w:sz w:val="18"/>
+                <w:sz w:val="16"/>
               </w:rPr>
               <w:t>OTPIntent</w:t>
             </w:r>
@@ -3743,6 +3860,9 @@
         </w:tc>
       </w:tr>
       <w:tr>
+        <w:trPr>
+          <w:cantSplit/>
+        </w:trPr>
         <w:tc>
           <w:tcPr>
             <w:tcW w:type="dxa" w:w="2304"/>
@@ -3769,7 +3889,7 @@
               <w:rPr>
                 <w:rFonts w:ascii="Arial" w:hAnsi="Arial"/>
                 <w:b w:val="0"/>
-                <w:sz w:val="18"/>
+                <w:sz w:val="16"/>
               </w:rPr>
               <w:t>UPICollectIntent</w:t>
             </w:r>
@@ -3841,6 +3961,9 @@
         </w:tc>
       </w:tr>
       <w:tr>
+        <w:trPr>
+          <w:cantSplit/>
+        </w:trPr>
         <w:tc>
           <w:tcPr>
             <w:tcW w:type="dxa" w:w="2304"/>
@@ -3866,7 +3989,7 @@
               <w:rPr>
                 <w:rFonts w:ascii="Arial" w:hAnsi="Arial"/>
                 <w:b w:val="0"/>
-                <w:sz w:val="18"/>
+                <w:sz w:val="16"/>
               </w:rPr>
               <w:t>QRCodeIntent</w:t>
             </w:r>
@@ -3936,6 +4059,9 @@
         </w:tc>
       </w:tr>
       <w:tr>
+        <w:trPr>
+          <w:cantSplit/>
+        </w:trPr>
         <w:tc>
           <w:tcPr>
             <w:tcW w:type="dxa" w:w="2304"/>
@@ -3962,7 +4088,7 @@
               <w:rPr>
                 <w:rFonts w:ascii="Arial" w:hAnsi="Arial"/>
                 <w:b w:val="0"/>
-                <w:sz w:val="18"/>
+                <w:sz w:val="16"/>
               </w:rPr>
               <w:t>PhishingLinkIntent</w:t>
             </w:r>
@@ -4034,6 +4160,9 @@
         </w:tc>
       </w:tr>
       <w:tr>
+        <w:trPr>
+          <w:cantSplit/>
+        </w:trPr>
         <w:tc>
           <w:tcPr>
             <w:tcW w:type="dxa" w:w="2304"/>
@@ -4059,7 +4188,7 @@
               <w:rPr>
                 <w:rFonts w:ascii="Arial" w:hAnsi="Arial"/>
                 <w:b w:val="0"/>
-                <w:sz w:val="18"/>
+                <w:sz w:val="16"/>
               </w:rPr>
               <w:t>FakeJobIntent</w:t>
             </w:r>
@@ -4129,6 +4258,9 @@
         </w:tc>
       </w:tr>
       <w:tr>
+        <w:trPr>
+          <w:cantSplit/>
+        </w:trPr>
         <w:tc>
           <w:tcPr>
             <w:tcW w:type="dxa" w:w="2304"/>
@@ -4155,7 +4287,7 @@
               <w:rPr>
                 <w:rFonts w:ascii="Arial" w:hAnsi="Arial"/>
                 <w:b w:val="0"/>
-                <w:sz w:val="18"/>
+                <w:sz w:val="16"/>
               </w:rPr>
               <w:t>ImpersonationIntent</w:t>
             </w:r>
@@ -4227,6 +4359,9 @@
         </w:tc>
       </w:tr>
       <w:tr>
+        <w:trPr>
+          <w:cantSplit/>
+        </w:trPr>
         <w:tc>
           <w:tcPr>
             <w:tcW w:type="dxa" w:w="2304"/>
@@ -4252,7 +4387,7 @@
               <w:rPr>
                 <w:rFonts w:ascii="Arial" w:hAnsi="Arial"/>
                 <w:b w:val="0"/>
-                <w:sz w:val="18"/>
+                <w:sz w:val="16"/>
               </w:rPr>
               <w:t>InvestmentIntent</w:t>
             </w:r>
@@ -4322,6 +4457,9 @@
         </w:tc>
       </w:tr>
       <w:tr>
+        <w:trPr>
+          <w:cantSplit/>
+        </w:trPr>
         <w:tc>
           <w:tcPr>
             <w:tcW w:type="dxa" w:w="2304"/>
@@ -4348,7 +4486,7 @@
               <w:rPr>
                 <w:rFonts w:ascii="Arial" w:hAnsi="Arial"/>
                 <w:b w:val="0"/>
-                <w:sz w:val="18"/>
+                <w:sz w:val="16"/>
               </w:rPr>
               <w:t>LoanAppIntent</w:t>
             </w:r>
@@ -4420,6 +4558,9 @@
         </w:tc>
       </w:tr>
       <w:tr>
+        <w:trPr>
+          <w:cantSplit/>
+        </w:trPr>
         <w:tc>
           <w:tcPr>
             <w:tcW w:type="dxa" w:w="2304"/>
@@ -4445,7 +4586,7 @@
               <w:rPr>
                 <w:rFonts w:ascii="Arial" w:hAnsi="Arial"/>
                 <w:b w:val="0"/>
-                <w:sz w:val="18"/>
+                <w:sz w:val="16"/>
               </w:rPr>
               <w:t>RemoteAccessIntent</w:t>
             </w:r>
@@ -4515,6 +4656,9 @@
         </w:tc>
       </w:tr>
       <w:tr>
+        <w:trPr>
+          <w:cantSplit/>
+        </w:trPr>
         <w:tc>
           <w:tcPr>
             <w:tcW w:type="dxa" w:w="2304"/>
@@ -4541,7 +4685,7 @@
               <w:rPr>
                 <w:rFonts w:ascii="Arial" w:hAnsi="Arial"/>
                 <w:b w:val="0"/>
-                <w:sz w:val="18"/>
+                <w:sz w:val="16"/>
               </w:rPr>
               <w:t>AccountCompromisedIntent</w:t>
             </w:r>
@@ -4613,6 +4757,9 @@
         </w:tc>
       </w:tr>
       <w:tr>
+        <w:trPr>
+          <w:cantSplit/>
+        </w:trPr>
         <w:tc>
           <w:tcPr>
             <w:tcW w:type="dxa" w:w="2304"/>
@@ -4638,7 +4785,7 @@
               <w:rPr>
                 <w:rFonts w:ascii="Arial" w:hAnsi="Arial"/>
                 <w:b w:val="0"/>
-                <w:sz w:val="18"/>
+                <w:sz w:val="16"/>
               </w:rPr>
               <w:t>ReportFraudIntent</w:t>
             </w:r>
@@ -4708,6 +4855,9 @@
         </w:tc>
       </w:tr>
       <w:tr>
+        <w:trPr>
+          <w:cantSplit/>
+        </w:trPr>
         <w:tc>
           <w:tcPr>
             <w:tcW w:type="dxa" w:w="2304"/>
@@ -4734,7 +4884,7 @@
               <w:rPr>
                 <w:rFonts w:ascii="Arial" w:hAnsi="Arial"/>
                 <w:b w:val="0"/>
-                <w:sz w:val="18"/>
+                <w:sz w:val="16"/>
               </w:rPr>
               <w:t>PreserveEvidenceIntent</w:t>
             </w:r>
@@ -4806,6 +4956,9 @@
         </w:tc>
       </w:tr>
       <w:tr>
+        <w:trPr>
+          <w:cantSplit/>
+        </w:trPr>
         <w:tc>
           <w:tcPr>
             <w:tcW w:type="dxa" w:w="2304"/>
@@ -4831,7 +4984,7 @@
               <w:rPr>
                 <w:rFonts w:ascii="Arial" w:hAnsi="Arial"/>
                 <w:b w:val="0"/>
-                <w:sz w:val="18"/>
+                <w:sz w:val="16"/>
               </w:rPr>
               <w:t>SafePaymentTipsIntent</w:t>
             </w:r>
@@ -4901,6 +5054,9 @@
         </w:tc>
       </w:tr>
       <w:tr>
+        <w:trPr>
+          <w:cantSplit/>
+        </w:trPr>
         <w:tc>
           <w:tcPr>
             <w:tcW w:type="dxa" w:w="2304"/>
@@ -4927,7 +5083,7 @@
               <w:rPr>
                 <w:rFonts w:ascii="Arial" w:hAnsi="Arial"/>
                 <w:b w:val="0"/>
-                <w:sz w:val="18"/>
+                <w:sz w:val="16"/>
               </w:rPr>
               <w:t>QuizStartIntent</w:t>
             </w:r>
@@ -4999,6 +5155,9 @@
         </w:tc>
       </w:tr>
       <w:tr>
+        <w:trPr>
+          <w:cantSplit/>
+        </w:trPr>
         <w:tc>
           <w:tcPr>
             <w:tcW w:type="dxa" w:w="2304"/>
@@ -5024,7 +5183,7 @@
               <w:rPr>
                 <w:rFonts w:ascii="Arial" w:hAnsi="Arial"/>
                 <w:b w:val="0"/>
-                <w:sz w:val="18"/>
+                <w:sz w:val="16"/>
               </w:rPr>
               <w:t>QuizSafeAnswerIntent</w:t>
             </w:r>
@@ -5094,6 +5253,9 @@
         </w:tc>
       </w:tr>
       <w:tr>
+        <w:trPr>
+          <w:cantSplit/>
+        </w:trPr>
         <w:tc>
           <w:tcPr>
             <w:tcW w:type="dxa" w:w="2304"/>
@@ -5120,7 +5282,7 @@
               <w:rPr>
                 <w:rFonts w:ascii="Arial" w:hAnsi="Arial"/>
                 <w:b w:val="0"/>
-                <w:sz w:val="18"/>
+                <w:sz w:val="16"/>
               </w:rPr>
               <w:t>QuizUnsafeAnswerIntent</w:t>
             </w:r>
@@ -5192,6 +5354,9 @@
         </w:tc>
       </w:tr>
       <w:tr>
+        <w:trPr>
+          <w:cantSplit/>
+        </w:trPr>
         <w:tc>
           <w:tcPr>
             <w:tcW w:type="dxa" w:w="2304"/>
@@ -5217,7 +5382,7 @@
               <w:rPr>
                 <w:rFonts w:ascii="Arial" w:hAnsi="Arial"/>
                 <w:b w:val="0"/>
-                <w:sz w:val="18"/>
+                <w:sz w:val="16"/>
               </w:rPr>
               <w:t>GoodbyeIntent</w:t>
             </w:r>
@@ -5302,7 +5467,7 @@
     </w:p>
     <w:p>
       <w:r>
-        <w:t>The English results below were observed in Dialogflow ES Try it now. A pass means the intended intent matched and the observed advice was safety aligned for that input; it does not prove every possible wording or integration path.</w:t>
+        <w:t>I marked a recorded English test as passed when Dialogflow matched the intended intent and returned safety-aligned advice for that input. These results show how the agent behaved for the recorded examples; they do not prove that it will recognise every possible wording.</w:t>
       </w:r>
     </w:p>
     <w:tbl>
@@ -5319,6 +5484,7 @@
       <w:tr>
         <w:trPr>
           <w:tblHeader w:val="true"/>
+          <w:cantSplit/>
         </w:trPr>
         <w:tc>
           <w:tcPr>
@@ -5421,6 +5587,9 @@
         </w:tc>
       </w:tr>
       <w:tr>
+        <w:trPr>
+          <w:cantSplit/>
+        </w:trPr>
         <w:tc>
           <w:tcPr>
             <w:tcW w:type="dxa" w:w="3384"/>
@@ -5516,6 +5685,9 @@
         </w:tc>
       </w:tr>
       <w:tr>
+        <w:trPr>
+          <w:cantSplit/>
+        </w:trPr>
         <w:tc>
           <w:tcPr>
             <w:tcW w:type="dxa" w:w="3384"/>
@@ -5614,6 +5786,9 @@
         </w:tc>
       </w:tr>
       <w:tr>
+        <w:trPr>
+          <w:cantSplit/>
+        </w:trPr>
         <w:tc>
           <w:tcPr>
             <w:tcW w:type="dxa" w:w="3384"/>
@@ -5709,6 +5884,9 @@
         </w:tc>
       </w:tr>
       <w:tr>
+        <w:trPr>
+          <w:cantSplit/>
+        </w:trPr>
         <w:tc>
           <w:tcPr>
             <w:tcW w:type="dxa" w:w="3384"/>
@@ -5807,6 +5985,9 @@
         </w:tc>
       </w:tr>
       <w:tr>
+        <w:trPr>
+          <w:cantSplit/>
+        </w:trPr>
         <w:tc>
           <w:tcPr>
             <w:tcW w:type="dxa" w:w="3384"/>
@@ -5902,6 +6083,9 @@
         </w:tc>
       </w:tr>
       <w:tr>
+        <w:trPr>
+          <w:cantSplit/>
+        </w:trPr>
         <w:tc>
           <w:tcPr>
             <w:tcW w:type="dxa" w:w="3384"/>
@@ -6000,6 +6184,9 @@
         </w:tc>
       </w:tr>
       <w:tr>
+        <w:trPr>
+          <w:cantSplit/>
+        </w:trPr>
         <w:tc>
           <w:tcPr>
             <w:tcW w:type="dxa" w:w="3384"/>
@@ -6095,6 +6282,9 @@
         </w:tc>
       </w:tr>
       <w:tr>
+        <w:trPr>
+          <w:cantSplit/>
+        </w:trPr>
         <w:tc>
           <w:tcPr>
             <w:tcW w:type="dxa" w:w="3384"/>
@@ -6193,6 +6383,9 @@
         </w:tc>
       </w:tr>
       <w:tr>
+        <w:trPr>
+          <w:cantSplit/>
+        </w:trPr>
         <w:tc>
           <w:tcPr>
             <w:tcW w:type="dxa" w:w="3384"/>
@@ -6288,6 +6481,9 @@
         </w:tc>
       </w:tr>
       <w:tr>
+        <w:trPr>
+          <w:cantSplit/>
+        </w:trPr>
         <w:tc>
           <w:tcPr>
             <w:tcW w:type="dxa" w:w="3384"/>
@@ -6386,6 +6582,9 @@
         </w:tc>
       </w:tr>
       <w:tr>
+        <w:trPr>
+          <w:cantSplit/>
+        </w:trPr>
         <w:tc>
           <w:tcPr>
             <w:tcW w:type="dxa" w:w="3384"/>
@@ -6481,6 +6680,9 @@
         </w:tc>
       </w:tr>
       <w:tr>
+        <w:trPr>
+          <w:cantSplit/>
+        </w:trPr>
         <w:tc>
           <w:tcPr>
             <w:tcW w:type="dxa" w:w="3384"/>
@@ -6579,6 +6781,9 @@
         </w:tc>
       </w:tr>
       <w:tr>
+        <w:trPr>
+          <w:cantSplit/>
+        </w:trPr>
         <w:tc>
           <w:tcPr>
             <w:tcW w:type="dxa" w:w="3384"/>
@@ -6674,6 +6879,9 @@
         </w:tc>
       </w:tr>
       <w:tr>
+        <w:trPr>
+          <w:cantSplit/>
+        </w:trPr>
         <w:tc>
           <w:tcPr>
             <w:tcW w:type="dxa" w:w="3384"/>
@@ -6779,7 +6987,7 @@
     </w:p>
     <w:p>
       <w:r>
-        <w:t>The latest screenshot shows the input “hi” and the configured English Welcome response when English was selected in Dialogflow.</w:t>
+        <w:t>Figure 3 shows the input “hi” matching Default Welcome Intent and returning the configured English welcome response when English was selected in Dialogflow.</w:t>
       </w:r>
     </w:p>
     <w:p>
@@ -6787,7 +6995,7 @@
         <w:pStyle w:val="Heading2"/>
       </w:pPr>
       <w:r>
-        <w:t>Hindi checks before importing the bilingual package</w:t>
+        <w:t>Hindi-language checks (limitations observed in the console)</w:t>
       </w:r>
     </w:p>
     <w:tbl>
@@ -6804,6 +7012,7 @@
       <w:tr>
         <w:trPr>
           <w:tblHeader w:val="true"/>
+          <w:cantSplit/>
         </w:trPr>
         <w:tc>
           <w:tcPr>
@@ -6906,6 +7115,9 @@
         </w:tc>
       </w:tr>
       <w:tr>
+        <w:trPr>
+          <w:cantSplit/>
+        </w:trPr>
         <w:tc>
           <w:tcPr>
             <w:tcW w:type="dxa" w:w="3672"/>
@@ -7001,6 +7213,9 @@
         </w:tc>
       </w:tr>
       <w:tr>
+        <w:trPr>
+          <w:cantSplit/>
+        </w:trPr>
         <w:tc>
           <w:tcPr>
             <w:tcW w:type="dxa" w:w="3672"/>
@@ -7099,6 +7314,9 @@
         </w:tc>
       </w:tr>
       <w:tr>
+        <w:trPr>
+          <w:cantSplit/>
+        </w:trPr>
         <w:tc>
           <w:tcPr>
             <w:tcW w:type="dxa" w:w="3672"/>
@@ -7194,6 +7412,9 @@
         </w:tc>
       </w:tr>
       <w:tr>
+        <w:trPr>
+          <w:cantSplit/>
+        </w:trPr>
         <w:tc>
           <w:tcPr>
             <w:tcW w:type="dxa" w:w="3672"/>
@@ -7292,6 +7513,9 @@
         </w:tc>
       </w:tr>
       <w:tr>
+        <w:trPr>
+          <w:cantSplit/>
+        </w:trPr>
         <w:tc>
           <w:tcPr>
             <w:tcW w:type="dxa" w:w="3672"/>
@@ -7387,6 +7611,9 @@
         </w:tc>
       </w:tr>
       <w:tr>
+        <w:trPr>
+          <w:cantSplit/>
+        </w:trPr>
         <w:tc>
           <w:tcPr>
             <w:tcW w:type="dxa" w:w="3672"/>
@@ -7500,7 +7727,7 @@
     </w:p>
     <w:p>
       <w:r>
-        <w:t>The following screenshots were supplied from the current ScamShieldAI Dialogflow ES console. They document the visible entity list, first page of the intent list, one Hindi fallback, and the English Welcome result.</w:t>
+        <w:t>The screenshots below show selected views and test results from the ScamShieldAI Dialogflow ES console. They show the custom entity list, the intent list, an English welcome response, and a Hindi money-loss input that reached the fallback intent. They are examples of console evidence, not screenshots of every test listed in Section 5.</w:t>
       </w:r>
     </w:p>
     <w:p>
@@ -7615,6 +7842,9 @@
         <w:gridCol w:w="4896"/>
       </w:tblGrid>
       <w:tr>
+        <w:trPr>
+          <w:cantSplit/>
+        </w:trPr>
         <w:tc>
           <w:tcPr>
             <w:tcW w:type="dxa" w:w="4997"/>

</xml_diff>